<commit_message>
Rewrite Margaret guide in client voice and record live checks
</commit_message>
<xml_diff>
--- a/deliverables/Margaret ArtByMe Product Pricing and Sales Tax Guide.docx
+++ b/deliverables/Margaret ArtByMe Product Pricing and Sales Tax Guide.docx
@@ -23,7 +23,7 @@
         <w:rPr>
           <w:b w:val="0"/>
         </w:rPr>
-        <w:t>Margaret, this guide explains how your products, print sizes, prices, and sales tax fit together. You can start with one artwork, finish its setup, and use that same saved listing for future sales. You do not need to rebuild a size every time someone buys it.</w:t>
+        <w:t>Margaret, I put this together so you can sit down with one painting and take it all the way from a new listing to a print someone can buy. I’ll walk you through the sizes, how to set your prices, and what to do about sales tax. Once you save a product and its sizes, they stay there for future orders. You won’t have to set them up again each time someone buys.</w:t>
       </w:r>
     </w:p>
     <w:p>
@@ -31,7 +31,7 @@
         <w:pStyle w:val="Heading2"/>
       </w:pPr>
       <w:r>
-        <w:t>A clearer explanation of the measurements</w:t>
+        <w:t>First let me clear up the size question</w:t>
       </w:r>
     </w:p>
     <w:p>
@@ -39,7 +39,7 @@
         <w:rPr>
           <w:b w:val="0"/>
         </w:rPr>
-        <w:t>I misspoke when I used DPI to explain the unusual sizes. I meant the file’s pixel measurements: the little dots across its width and height. The system uses the shape formed by those measurements. It cannot measure the piece of paper you painted on.</w:t>
+        <w:t>I misspoke when I used the term DPI. I meant the actual pixel-by-pixel measurements of the file: how many tiny picture dots it has across and down. Those measurements tell the system the shape of the image. DPI tells us how much detail will fit into each inch of a print.</w:t>
       </w:r>
     </w:p>
     <w:p>
@@ -47,7 +47,7 @@
         <w:rPr>
           <w:b w:val="0"/>
         </w:rPr>
-        <w:t>A scan or earlier file editing can give a digital image slightly different proportions from the original paper. A crop can also change a file’s shape. Our audit found that the 39 linked masters currently use their full uploaded images, with the same original and prepared pixel dimensions. So we should not blame the current crop tool for these particular differences.</w:t>
+        <w:t>The digital file can be a little different from the size of the original painting. It may have come back from scanning that way, or a crop may have trimmed a little from an edge. Either can change the shape. We would need to compare a particular file with the original to know what happened to that artwork.</w:t>
       </w:r>
     </w:p>
     <w:p>
@@ -55,7 +55,7 @@
         <w:rPr>
           <w:b w:val="0"/>
         </w:rPr>
-        <w:t>The old size generator kept each file’s shape and rounded the measurements to 0.05 inch. For example, Aikens-Rhett House has a 4,840 by 4,800 pixel file. Scaling that almost-square file produces 20 by 19.85 inches. The program is preserving the file’s shape; the description of the original paper does not override it.</w:t>
+        <w:t>For example, if a file’s shape works out to 16 × 19.85 inches when printed 16 inches wide, that is the size the system reports. Changing the DPI number or writing “16 × 20” in the description won’t change the shape of the picture.</w:t>
       </w:r>
     </w:p>
     <w:p>
@@ -63,7 +63,7 @@
         <w:pStyle w:val="Heading2"/>
       </w:pPr>
       <w:r>
-        <w:t>What the fix does</w:t>
+        <w:t>What you and your customers will see</w:t>
       </w:r>
     </w:p>
     <w:p>
@@ -71,7 +71,7 @@
         <w:rPr>
           <w:b w:val="0"/>
         </w:rPr>
-        <w:t>The editor now lets you choose an exact common size, such as 16 by 20. It keeps that choice exact. If the file’s shape does not fit, it opens a matching crop for you to review. Saving starts preparation of the print file, and the editor updates when it is ready.</w:t>
+        <w:t>When a print is close to a common size, the main label shows the familiar size, such as 16 × 20. The smaller “actual cropped size” line directly below shows its exact measurements, such as 16 × 19.85. Lumaprints still receives the exact saved measurements. You and your customers can use the smaller line when choosing a frame or mat.</w:t>
       </w:r>
     </w:p>
     <w:p>
@@ -79,7 +79,7 @@
         <w:rPr>
           <w:b w:val="0"/>
         </w:rPr>
-        <w:t>Near-standard options now show the familiar size on top, with “(actual cropped size: …)” directly below in smaller text. For example, the main label can say 20 × 20 while the line below says 20 × 19.85. This wording helps you and the buyer compare sizes. It does not change the file or the exact measurements sent to Lumaprints. Use the actual-size line when planning a frame.</w:t>
+        <w:t>If you want the print itself to be exactly 16 × 20, choose that size under Add print size. If the artwork needs a different shape, choose Prepare crop and review the edges before you save. The system prepares the print file and lets you know when it is ready. Page 4 walks you through it.</w:t>
       </w:r>
     </w:p>
     <w:p>
@@ -131,7 +131,7 @@
         <w:rPr>
           <w:b w:val="0"/>
         </w:rPr>
-        <w:t>A product is one shop listing, such as Bluebonnets at Sunset. A variant is one buying choice inside it, such as a 16 by 20 paper print. A different material or size is another variant. The photo is the picture shoppers see. The master is the detailed file used for printing.</w:t>
+        <w:t>Start with one painting. Its product page can offer several sizes and materials, so you don’t need a separate listing for every print. The editor sometimes calls each choice a variant. Your product photo is what shoppers see; your master artwork is the detailed file Lumaprints uses to make the print.</w:t>
       </w:r>
     </w:p>
     <w:p>
@@ -147,7 +147,7 @@
         <w:rPr>
           <w:b w:val="0"/>
         </w:rPr>
-        <w:t>2. Choose Create draft &amp; continue once. Your saved draft opens in the same full editor used for existing products. Draft keeps the listing off the public shop while you work.</w:t>
+        <w:t>2. Choose Create draft &amp; continue once. Your draft opens with room to add the rest. A draft is saved for you, but customers cannot buy it yet.</w:t>
       </w:r>
     </w:p>
     <w:p>
@@ -179,7 +179,7 @@
         <w:rPr>
           <w:b w:val="0"/>
         </w:rPr>
-        <w:t>6. Under Editing prices for, select the profile you want to prepare. Read Store currently uses. Editing a profile does not switch the whole shop between Lumaprints and your studio.</w:t>
+        <w:t>6. Under Editing prices for, choose Lumaprints or My studio. You can keep prices ready for both. Store currently uses tells you which set your customers will see. To change who handles new orders, use the shop’s fulfillment setting.</w:t>
       </w:r>
     </w:p>
     <w:p>
@@ -219,7 +219,7 @@
         <w:rPr>
           <w:b w:val="0"/>
         </w:rPr>
-        <w:t>After you save a size and make it live, it stays with that product. Buyers can choose it on the product page for future orders. You do not create it again for every customer. Each product and material needs its own saved options. Prices, files, stock, or availability may still need updates later.</w:t>
+        <w:t>Save a size, make it live, and it stays with that product for the next customer and the one after that. You only need to return when you want to change something, such as the price or which sizes you offer. Set up the choices you want for each painting and each material.</w:t>
       </w:r>
     </w:p>
     <w:p>
@@ -227,7 +227,7 @@
         <w:rPr>
           <w:b w:val="0"/>
         </w:rPr>
-        <w:t>If an option is missing, check the product’s Active status, the option’s Live setting, the shop’s current fulfillment profile, and the required file or studio approval. A draft option is saved for you but is not ready for buyers.</w:t>
+        <w:t>If a size doesn’t appear in the shop, check that the product is Active and the size is Live. Then check Store currently uses and the print file or studio approval. A draft size is saved; it just isn’t being offered to customers yet.</w:t>
       </w:r>
     </w:p>
     <w:p>
@@ -263,7 +263,7 @@
         <w:rPr>
           <w:b w:val="0"/>
         </w:rPr>
-        <w:t>Small, Medium, and Large give you a quick starting menu. They describe size tiers. They do not promise the same width and height for every painting, and they are not a limit of three options per product.</w:t>
+        <w:t>I’d start with Small, Medium, and Large. That gives your customers an easy choice without making them sort through dozens of sizes. You can add more whenever you want. Three is a useful starting point, not a limit.</w:t>
       </w:r>
     </w:p>
     <w:p>
@@ -271,7 +271,7 @@
         <w:rPr>
           <w:b w:val="0"/>
         </w:rPr>
-        <w:t>The default generator aims for a LONGER side of 12 inches for Small, 20 inches for Medium, and 30 inches for Large. A portrait’s longer side is usually its height. A landscape’s longer side is usually its width. The other side changes to preserve the artwork’s shape.</w:t>
+        <w:t>Think of the sizes this way: Small has a 12-inch long edge, Medium has a 20-inch long edge, and Large has a 30-inch long edge. The other edge follows the shape of your painting. For a tall painting, the height is the long edge. For a wide painting, it is the width.</w:t>
       </w:r>
     </w:p>
     <w:tbl>
@@ -816,7 +816,7 @@
         <w:rPr>
           <w:b w:val="0"/>
         </w:rPr>
-        <w:t>All measurements above are inches. For the landscape example, the height is three quarters of the width. Small is 12 inches wide, so 12 times three quarters is 9 inches tall. Medium is 20 wide and 15 tall. Large is 30 wide and 22.5 tall. The art keeps its shape at every size.</w:t>
+        <w:t>All the measurements in this table are inches. A square painting is easy: its Medium print is 20 × 20. For the wide painting in the last row, the height is three quarters of the width. Small is 12 inches wide, so 12 × ¾ = 9 inches tall. Medium is 20 × 15. The picture gets bigger without being stretched.</w:t>
       </w:r>
     </w:p>
     <w:p>
@@ -832,7 +832,7 @@
         <w:rPr>
           <w:b w:val="0"/>
         </w:rPr>
-        <w:t>First, repeatable target sizes make setup and checking easier. The same button can prepare a short list for very different paintings, without stretching them.</w:t>
+        <w:t>Your customer can start by thinking, “Do I want a little piece for my desk or something larger for the wall?” Small, Medium, and Large make that decision easier to understand. They can then read the measurements to choose the right fit.</w:t>
       </w:r>
     </w:p>
     <w:p>
@@ -840,7 +840,7 @@
         <w:rPr>
           <w:b w:val="0"/>
         </w:rPr>
-        <w:t>Second, the presets save time. You can review a few generated options for each material instead of calculating every dimension yourself. The same saved options serve later purchases.</w:t>
+        <w:t>It also saves you work. Choose Generate S/M/L, look over the sizes and prices, and turn on Live for the ones you want to sell. You can use that same approach for each painting instead of starting the math over every time.</w:t>
       </w:r>
     </w:p>
     <w:p>
@@ -848,7 +848,7 @@
         <w:rPr>
           <w:b w:val="0"/>
         </w:rPr>
-        <w:t>Third, a short menu gives shoppers a simpler first choice. Small, Medium, and Large are familiar words. This is the reason for the design; it is not a promise of a particular increase in sales. Add more choices when they serve your customers.</w:t>
+        <w:t>If customers keep asking for an 8 × 10, add it. If you only want to offer two sizes of a painting, keep two. You decide what belongs in your shop, and the saved choices stay available for future orders.</w:t>
       </w:r>
     </w:p>
     <w:p>
@@ -864,7 +864,7 @@
         <w:rPr>
           <w:b w:val="0"/>
         </w:rPr>
-        <w:t>Generate S/M/L may create fewer than three sizes. A size can be skipped if the file lacks enough detail, the material cannot be made at that size, or the shape fails a check. Read the reason shown. Repeated dimensions are also removed.</w:t>
+        <w:t>Sometimes Generate S/M/L offers fewer than three sizes. A small image may not have enough detail for a large sharp print, or a material may not be available in that size. Read the message beside the option to see what needs attention.</w:t>
       </w:r>
     </w:p>
     <w:p>
@@ -872,7 +872,7 @@
         <w:rPr>
           <w:b w:val="0"/>
         </w:rPr>
-        <w:t>Thirty inches is the default Large target, not a universal maximum or a guarantee of sharpness. A supported larger custom size may be possible. A weak file may need a smaller print. The real protection is checking the file, the material’s limits, and the result before selling it.</w:t>
+        <w:t>Large starts with a 30-inch edge. You may be able to go larger if the file has enough detail and Lumaprints supports that size and material. For a smaller file, offering a smaller print can give you a better-looking result.</w:t>
       </w:r>
     </w:p>
     <w:p>
@@ -893,7 +893,7 @@
         <w:rPr>
           <w:b w:val="0"/>
         </w:rPr>
-        <w:t>You can add more than three sizes. Add as many useful, supported options as you want to maintain. Each one needs a valid file, a workable material, a price, and the proper live setting. More sizes do not require more copies of the same product listing.</w:t>
+        <w:t>You can add another size to the painting you already saved. I’d add the sizes you expect people to want, check the price, and make them live when you’re happy with them. You can always come back and add more.</w:t>
       </w:r>
     </w:p>
     <w:p>
@@ -917,7 +917,7 @@
         <w:rPr>
           <w:b w:val="0"/>
         </w:rPr>
-        <w:t>3. Read the width and height. Standard choices stay exact. In Custom mode, changing one side updates the other to preserve the file’s shape. Custom measurements use 0.05-inch steps.</w:t>
+        <w:t>3. Read the width and height. A standard choice keeps those exact measurements. If you choose Custom, changing one side updates the other so the picture keeps its shape.</w:t>
       </w:r>
     </w:p>
     <w:p>
@@ -941,7 +941,7 @@
         <w:rPr>
           <w:b w:val="0"/>
         </w:rPr>
-        <w:t>6. Review the name, measurements, validation messages, and selling price. Save as Draft if you are still deciding. Save &amp; Publish makes a valid option live; existing rows also have a Live control.</w:t>
+        <w:t>6. Review the name, measurements, any messages about the file, and the selling price. Choose Save as Draft if you are still deciding. Choose Save &amp; Publish when it is ready for customers. Existing rows also have a Live control.</w:t>
       </w:r>
     </w:p>
     <w:p>
@@ -965,7 +965,7 @@
         <w:rPr>
           <w:b w:val="0"/>
         </w:rPr>
-        <w:t>The editor currently uses one prepared master shape for the product’s Lumaprints options. A 4:5 file supports 8 × 10, 16 × 20, and 24 × 30. A square is a different shape. Creating a new shared crop can affect existing sizes and other products attached to that master. Review them before continuing to sell them.</w:t>
+        <w:t>The print sizes on a product share a prepared master file. A 4:5 picture has the same shape as 8 × 10, 16 × 20, and 24 × 30. A square needs a different crop. If you change a master, look over the sizes already using it, including any other products linked to that file. Keep a separate product and master when you need a different crop for another shape.</w:t>
       </w:r>
     </w:p>
     <w:p>
@@ -973,7 +973,7 @@
         <w:rPr>
           <w:b w:val="0"/>
         </w:rPr>
-        <w:t>Matte border adds padding around the selected crop; it does not fit an uncut image into any new shape or order a physical mat. If every painted edge must stay, have a print professional prepare a properly bordered file for the chosen shape. Use a separately prepared product/master when a different shape needs its own composition.</w:t>
+        <w:t>If you want every painted edge to stay in the print, don’t save a crop that cuts one off. A print professional can prepare a file with the right border for the size you want. The Matte border setting adds a printed border around your chosen crop. It doesn’t change that crop’s shape or include a physical mat board or frame.</w:t>
       </w:r>
     </w:p>
     <w:p>
@@ -981,7 +981,7 @@
         <w:rPr>
           <w:b w:val="0"/>
         </w:rPr>
-        <w:t>The main size label is a familiar reference for a near-standard option. Directly below, the smaller “actual cropped size” line shows the exact saved width and height in inches. A 16 × 20 heading with an actual 16 × 19.85 line still orders a 16 × 19.85 print. A truly exact 16 × 20 option needs a matching prepared file. Check the actual-size line, frame opening, border, and mat before buying a frame.</w:t>
+        <w:t>Before choosing a frame, read the “actual cropped size” line beneath the main size. A familiar 16 × 20 label may have an actual size of 16 × 19.85. Those smaller measurements are what Lumaprints receives. Use the exact-size steps above if you need the print itself to measure exactly 16 × 20, and check the frame opening and mat too.</w:t>
       </w:r>
     </w:p>
     <w:p>
@@ -1017,7 +1017,7 @@
         <w:rPr>
           <w:b w:val="0"/>
         </w:rPr>
-        <w:t>Cost is what you spend. Price is what you charge. Profit is what remains after the costs you subtract. In the Lumaprints controls, the field named Margin % actually means MARKUP: extra money added to the counted cost. Gross margin is a different percentage.</w:t>
+        <w:t>Here is how I’d think about pricing. Start with what the print costs you, then add the money you want to earn. In the Lumaprints editor, Margin % is the extra percentage added to your cost. That is called markup. The Gross number answers a different question: how much of the selling price is left after the print and shipping costs?</w:t>
       </w:r>
     </w:p>
     <w:p>
@@ -1033,7 +1033,7 @@
         <w:rPr>
           <w:b w:val="0"/>
         </w:rPr>
-        <w:t>1. Suppose printing costs $15 and stored shipping costs $5. Add them: $15 + $5 = $20 counted cost.</w:t>
+        <w:t>1. Suppose printing costs $15 and shipping costs $5. Add them: $15 + $5 = $20 total cost.</w:t>
       </w:r>
     </w:p>
     <w:p>
@@ -1057,7 +1057,7 @@
         <w:rPr>
           <w:b w:val="0"/>
         </w:rPr>
-        <w:t>4. Subtract the counted cost from that price: $40 − $20 = $20 gross profit before other expenses.</w:t>
+        <w:t>4. Subtract the total cost from that price: $40 − $20 = $20 gross profit before other expenses.</w:t>
       </w:r>
     </w:p>
     <w:p>
@@ -1170,7 +1170,7 @@
                 <w:color w:val="FFFFFF"/>
                 <w:sz w:val="20"/>
               </w:rPr>
-              <w:t>Counted cost</w:t>
+              <w:t>Total cost</w:t>
             </w:r>
           </w:p>
         </w:tc>
@@ -2067,7 +2067,7 @@
         <w:rPr>
           <w:b w:val="0"/>
         </w:rPr>
-        <w:t>If you see 200 in a size’s Margin % field, it adds twice the counted cost. With a $20 cost, that adds $40: $20 + $40 = a $60 price. The $40 gross profit is about two thirds of $60, so Gross is about 67%.</w:t>
+        <w:t>If you see 200 in a size’s Margin % field, it adds twice the total cost. With a $20 cost, that adds $40: $20 + $40 = a $60 price. The $40 gross profit is about two thirds of $60, so Gross is about 67%.</w:t>
       </w:r>
     </w:p>
     <w:p>
@@ -2075,7 +2075,7 @@
         <w:rPr>
           <w:b w:val="0"/>
         </w:rPr>
-        <w:t>The Gross figure is a pricing estimate. It does not subtract all card fees, advertising, your time, refunds, or included sales tax. Stored shipping is an allowance used in the calculation, not proof of the exact postage paid on every order. Your final take-home profit can be lower.</w:t>
+        <w:t>I’d use Gross to help choose a price, then leave room for your other expenses. Card fees, advertising, your time, refunds, and any sales tax included in the price still have to come out. The shipping cost saved with the size helps with this estimate; the actual postage can vary from order to order.</w:t>
       </w:r>
     </w:p>
     <w:p>
@@ -2119,7 +2119,7 @@
         <w:rPr>
           <w:b w:val="0"/>
         </w:rPr>
-        <w:t>Start with a shop default, then make exceptions only where needed. The most specific saved choice wins. A manual selling price comes first. Otherwise the app checks the size markup, product markup, primary category markup, and shop markup in that order. If none is set, the fallback is 100%.</w:t>
+        <w:t>I’d start with one shop markup, then make exceptions where needed. Say the shop uses 100%, one painting uses 150%, and one size uses 200%. That size uses 200%. Give it an exact manual price, and it uses that price instead.</w:t>
       </w:r>
     </w:p>
     <w:p>
@@ -2127,7 +2127,15 @@
         <w:rPr>
           <w:b w:val="0"/>
         </w:rPr>
-        <w:t>Blank at an override level means “use the rule above me.” Zero means a real 0% markup. It does not mean blank. A manual price stays fixed when costs refresh, so check it when supplier costs change.</w:t>
+        <w:t>The order is: manual price first; otherwise size markup, product markup, main category markup, then shop markup. The app uses the first filled-in choice. If all are blank, it uses 100%.</w:t>
+      </w:r>
+    </w:p>
+    <w:p>
+      <w:r>
+        <w:rPr>
+          <w:b w:val="0"/>
+        </w:rPr>
+        <w:t>Leave a custom markup blank to use the broader setting. Enter 0 to add nothing to the cost. A manual price stays fixed when supplier costs change, so check it after refreshing costs.</w:t>
       </w:r>
     </w:p>
     <w:tbl>
@@ -2556,7 +2564,7 @@
         <w:rPr>
           <w:b w:val="0"/>
         </w:rPr>
-        <w:t>Use Refresh all prices to update provider costs and eligible automatic prices, then review the results and any skipped options. A more specific markup or manual override can explain why one price differs from the shop default. Do not treat a refresh as confirmation that every draft is ready to sell.</w:t>
+        <w:t>Use Refresh all prices for new supplier costs and prices that use markup. Review the results before making sizes live. If one price stays different, check its own markup or manual price.</w:t>
       </w:r>
     </w:p>
     <w:p>
@@ -2572,7 +2580,7 @@
         <w:rPr>
           <w:b w:val="0"/>
         </w:rPr>
-        <w:t>Under Editing prices for, choose My studio. Enter each final Selling price ($) yourself. The Lumaprints markup does not calculate that amount. For an original, set Base price in the main product editor.</w:t>
+        <w:t>Choose My studio under Editing prices for. Enter the final amount you want to charge in Selling price ($). For an original painting, use Base price in the main product editor.</w:t>
       </w:r>
     </w:p>
     <w:p>
@@ -2580,7 +2588,7 @@
         <w:rPr>
           <w:b w:val="0"/>
         </w:rPr>
-        <w:t>For example, $12 production + $3 packing + $5 postage = $20 before your time. A $40 shipping-included studio price leaves $20 before tax, fees, and other expenses. If you want to pay yourself for work time, count that cost before deciding what profit you want.</w:t>
+        <w:t>For example, $12 production + $3 packing + $5 postage = $20. A $40 price with shipping included leaves $20 before tax, fees, and other expenses. Count your work time too when deciding what profit you want.</w:t>
       </w:r>
     </w:p>
     <w:p>
@@ -2596,7 +2604,7 @@
         <w:rPr>
           <w:b w:val="0"/>
         </w:rPr>
-        <w:t>Shipping included means you cover postage inside the price. A flat fee adds shipping for the buyer. Check option overrides and the shop’s current fulfillment profile so you are reviewing the price the customer will actually see.</w:t>
+        <w:t>Shipping included covers postage inside your price. A flat fee adds shipping at checkout. Check each size’s shipping choice and Store currently uses to see what your customers will pay.</w:t>
       </w:r>
     </w:p>
     <w:p>
@@ -2632,7 +2640,7 @@
         <w:rPr>
           <w:b w:val="0"/>
         </w:rPr>
-        <w:t>Sales tax is money collected for a government. It is not the same as your profit or income tax. A taxable sale can require sales tax whether the order is printed by Lumaprints or fulfilled by your studio.</w:t>
+        <w:t>Think of sales tax as money you collect for the state and set aside until it is time to pay. It isn’t yours to spend as profit. It is also separate from income tax. Sales tax can apply whether Lumaprints makes the print or you send the art from your studio.</w:t>
       </w:r>
     </w:p>
     <w:p>
@@ -2640,7 +2648,7 @@
         <w:rPr>
           <w:b w:val="0"/>
         </w:rPr>
-        <w:t>Nexus means a business has enough connection to a state for that state’s tax rules to apply. A business location, workers, inventory, or enough sales may create that connection. The rules differ by state. Your Texas business location is the starting point for reviewing Texas collection. Check other states when your business activity changes. [1]</w:t>
+        <w:t>Nexus is the tax term for having enough of a connection to a state that you may need to collect its sales tax. Having your business there is one way. Workers, inventory, or a large enough amount of sales can also count. Since your business is in Texas, start with Texas. Review other states as your business grows or changes. [1]</w:t>
       </w:r>
     </w:p>
     <w:p>
@@ -2648,7 +2656,7 @@
         <w:pStyle w:val="Heading2"/>
       </w:pPr>
       <w:r>
-        <w:t>The platform has one choice with three settings</w:t>
+        <w:t>Choose how you want to handle tax</w:t>
       </w:r>
     </w:p>
     <w:tbl>
@@ -2726,7 +2734,7 @@
                 <w:color w:val="FFFFFF"/>
                 <w:sz w:val="20"/>
               </w:rPr>
-              <w:t>What it does for an applicable taxable sale</w:t>
+              <w:t>How it handles tax when tax is due</w:t>
             </w:r>
           </w:p>
         </w:tc>
@@ -2947,7 +2955,7 @@
         <w:rPr>
           <w:b w:val="0"/>
         </w:rPr>
-        <w:t>Under States where your business has nexus, select the states where you need to collect and have active registrations. Then choose Save sales tax. Checking a state does not register your business, and clicking a choice is not enough until the save succeeds.</w:t>
+        <w:t>In States where your business has nexus, check the states where you need to collect and have completed registration with a start date that has arrived. Choose Save sales tax when you are done. Getting the state account is a separate step; checking the box tells your shop where to collect. I’ve included the Texas registration link and steps on page 9.</w:t>
       </w:r>
     </w:p>
     <w:p>
@@ -2963,7 +2971,7 @@
         <w:rPr>
           <w:b w:val="0"/>
         </w:rPr>
-        <w:t>Suppose collection is on, Texas is the only selected state, and its registration is active. One buyer has a taxable print delivered to Texas. Checkout calculates the applicable tax. Separate mode adds it; included mode identifies the part already inside the price.</w:t>
+        <w:t>Let’s say you have set up Texas and it is the only state you selected. A customer orders a print to be delivered in Texas. Checkout calculates the tax for that sale. If you chose Add tax at checkout, it adds the tax. If you chose Include tax in my prices, it works out how much tax is already inside the price.</w:t>
       </w:r>
     </w:p>
     <w:p>
@@ -2971,7 +2979,7 @@
         <w:rPr>
           <w:b w:val="0"/>
         </w:rPr>
-        <w:t>A second buyer has the print delivered to a state you did not select. This platform setting collects $0 for that destination. The delivery address matters, not the person’s website browsing location. The customer’s own tax duties are separate from what this seller collects.</w:t>
+        <w:t>Now another customer orders for delivery to a state you didn’t select. Your shop collects $0 in sales tax on that order. It uses the delivery address to make this decision. The customer may still have their own state tax duties.</w:t>
       </w:r>
     </w:p>
     <w:p>
@@ -2979,7 +2987,7 @@
         <w:rPr>
           <w:b w:val="0"/>
         </w:rPr>
-        <w:t>In included mode, the same listed price remains for an unselected destination. The platform does not remove an assumed Texas tax amount as a discount. Adding or removing a state today also does not recalculate yesterday’s saved orders.</w:t>
+        <w:t>If you include tax in your prices, that second customer still pays the listed price. The shop doesn’t take off a guessed Texas tax amount as a discount. Changing your selected states affects new purchases; it doesn’t rewrite the tax saved on past orders.</w:t>
       </w:r>
     </w:p>
     <w:p>
@@ -2995,7 +3003,7 @@
         <w:rPr>
           <w:b w:val="0"/>
         </w:rPr>
-        <w:t>Texas has a 6.25% state rate, with local taxes that can add up to 2%. The correct local result depends on the sale and the business setup. Use accurate seller and delivery addresses in Stripe Tax. Do not force every order to 8.25%; that is only the example rate used on the next page. Shipping can also be taxable. [2]</w:t>
+        <w:t>Texas charges 6.25% state tax. Local taxes can add up to 2% more. The right total depends on the sale and the addresses involved, so keep your business address correct in Stripe Tax and let checkout use the customer’s delivery address. Shipping can also be taxable. I use 8.25% on the next page to make the example easy to follow; the actual rate can be lower. [2]</w:t>
       </w:r>
     </w:p>
     <w:p>
@@ -3031,7 +3039,7 @@
         <w:rPr>
           <w:b w:val="0"/>
         </w:rPr>
-        <w:t>These examples use one taxable item, an example 8.25% rate, and no shipping charge, discount, or other fee. Checkout calculates the real transaction and rounds money to cents.</w:t>
+        <w:t>Let’s use a $100 print and an example tax rate of 8.25%. We’ll leave out shipping, discounts, and fees so you can see just what the tax does. Checkout handles the actual amounts for each order.</w:t>
       </w:r>
     </w:p>
     <w:tbl>
@@ -3509,7 +3517,7 @@
         <w:rPr>
           <w:b w:val="0"/>
         </w:rPr>
-        <w:t>Switching tax modes does not automatically raise product prices. If you want $100 in sales money before expenses at this example rate, an included price would be $108.25. An included price of $100 gives you only about $92.38 before costs.</w:t>
+        <w:t>Before you choose included tax, look at your prices. The shop won’t raise them for you when you change this setting. If you want to keep $100 before expenses at our example rate, you would list the tax-included price at $108.25. Listing it at $100 leaves about $92.38 before costs.</w:t>
       </w:r>
     </w:p>
     <w:p>
@@ -3517,7 +3525,7 @@
         <w:rPr>
           <w:b w:val="0"/>
         </w:rPr>
-        <w:t>Return to the $40 print with $20 counted costs. Separate tax at 8.25% makes the buyer total $43.30; sales before costs remain $40. Included tax inside a $40 price is about $3.05, leaving about $36.95 in sales money and $16.95 after those $20 costs. The pricing panel’s gross estimate does not automatically subtract that included tax.</w:t>
+        <w:t>Return to the $40 print with $20 total costs. Separate tax at 8.25% makes the buyer total $43.30; sales before costs remain $40. Included tax inside a $40 price is about $3.05, leaving about $36.95 in sales money and $16.95 after those $20 costs. The pricing panel’s gross estimate does not automatically subtract that included tax.</w:t>
       </w:r>
     </w:p>
     <w:p>
@@ -3525,7 +3533,7 @@
         <w:rPr>
           <w:b w:val="0"/>
         </w:rPr>
-        <w:t>For included Texas sales, the Comptroller specifies this disclosure: “Texas state and local sales and use tax is included in the sales price.” The platform shows the Texas statement for applicable included-tax orders. Check the customer-facing result before launch. [3]</w:t>
+        <w:t>For Texas orders with included tax, the shop uses the state’s required wording: “Texas state and local sales and use tax is included in the sales price.” Look for that statement when you review a Texas checkout. [3]</w:t>
       </w:r>
     </w:p>
     <w:p>
@@ -3546,7 +3554,7 @@
         <w:rPr>
           <w:b w:val="0"/>
         </w:rPr>
-        <w:t>There are three separate jobs: get the state account, record the active registration in Stripe Tax, and save your collection choices in ArtByMe. Completing only one job is not enough.</w:t>
+        <w:t>Start with your Texas sales tax account. Then add that registration to Stripe Tax and choose how your shop should collect. I’ve put the links below so you can work through these steps in order.</w:t>
       </w:r>
     </w:p>
     <w:p>
@@ -3562,7 +3570,7 @@
         <w:rPr>
           <w:b w:val="0"/>
         </w:rPr>
-        <w:t>2. Open Stripe Tax for the account and live or test mode the shop uses. Complete the business address and tax setup, including the appropriate product tax code. A test registration does not activate a live shop. [5]</w:t>
+        <w:t>2. Open Stripe Tax in the account your shop uses. For customer purchases, use the live account. Enter your business address and choose the product tax code that describes what you sell. A registration saved only in test mode won’t turn on tax for real orders. [5]</w:t>
       </w:r>
     </w:p>
     <w:p>
@@ -3578,7 +3586,7 @@
         <w:rPr>
           <w:b w:val="0"/>
         </w:rPr>
-        <w:t>4. Open ArtByMe Settings → Sales tax. Use What is nexus? · Tax guide if you want the in-platform explanation. The section also offers Register in Texas and Open Stripe Tax links.</w:t>
+        <w:t>4. Open ArtByMe Settings → Sales tax. You can open What is nexus? · Tax guide for a reminder. Register in Texas and Open Stripe Tax are also linked here.</w:t>
       </w:r>
     </w:p>
     <w:p>
@@ -3594,7 +3602,7 @@
         <w:rPr>
           <w:b w:val="0"/>
         </w:rPr>
-        <w:t>6. Under States where your business has nexus, find and select Texas. Add other states only as your duties and active registrations require.</w:t>
+        <w:t>6. Under States where your business has nexus, find and select Texas. Add another state when you also need to collect there and your registration is ready to use.</w:t>
       </w:r>
     </w:p>
     <w:p>
@@ -3602,7 +3610,7 @@
         <w:rPr>
           <w:b w:val="0"/>
         </w:rPr>
-        <w:t>7. Use Check Stripe setup to review readiness. If something is missing, correct the business address, product tax setup, or active registration. Read the actual error rather than guessing a tax rate.</w:t>
+        <w:t>7. Choose Check Stripe setup. If it finds something missing, follow the message to finish your business address, product tax setup, or registration.</w:t>
       </w:r>
     </w:p>
     <w:p>
@@ -3618,7 +3626,7 @@
         <w:rPr>
           <w:b w:val="0"/>
         </w:rPr>
-        <w:t>9. Review a taxable checkout with a Texas delivery address. Confirm the included-tax wording or added tax line. Compare an unselected delivery state. Use the designated test environment for payment tests; a live checkout payment is a real transaction.</w:t>
+        <w:t>9. Open checkout with a Texas delivery address and look for the included-tax statement or added tax amount. Compare an address in a state you did not select. You can review the total before paying. Completing a payment in the live shop places a real order.</w:t>
       </w:r>
     </w:p>
     <w:p>
@@ -3692,7 +3700,7 @@
         <w:rPr>
           <w:b w:val="0"/>
         </w:rPr>
-        <w:t>Open Dashboard and find Tax by state. It reports saved order tax from both included and separate collection. Use Reporting period to choose Last 30 days, Last 90 days, Last 365 days, This quarter, or This year. Only eligible paid live orders appear; test orders and unknown payment modes are excluded.</w:t>
+        <w:t>Open Dashboard → Tax by state to see tax included in prices and added at checkout. Under Reporting period, choose Last 30 days, Last 90 days, Last 365 days, This quarter, or This year. It shows qualifying paid orders from the live shop; test orders and orders with an unknown live/test setting are left out.</w:t>
       </w:r>
     </w:p>
     <w:p>
@@ -3700,7 +3708,7 @@
         <w:rPr>
           <w:b w:val="0"/>
         </w:rPr>
-        <w:t>Last 90 days is a rolling window; it is not the same as a calendar quarter. Last 365 days also differs from a calendar year. The report uses America/Chicago dates and groups orders by when they were created. Use the dates required for your return, then reconcile the records.</w:t>
+        <w:t>Last 90 days counts back from today; This quarter starts at the calendar quarter’s beginning. Last 365 days also differs from This year. Dates use Chicago time and follow when the order was created. Compare these dates with the period your tax return covers.</w:t>
       </w:r>
     </w:p>
     <w:p>
@@ -3716,7 +3724,7 @@
         <w:rPr>
           <w:b w:val="0"/>
         </w:rPr>
-        <w:t>State rows show Included tax, Added tax, Full-refund tax, and Net recorded tax. Net recorded tax is the saved tax less tax on orders currently marked fully refunded. It is a useful record of collection, not a final bill saying how much you still owe.</w:t>
+        <w:t>Each state shows Included tax, Added tax, Full-refund tax, and Net recorded tax. Add included and added tax, then subtract tax on orders marked fully refunded. The result is Net recorded tax: what the shop has recorded after those full refunds.</w:t>
       </w:r>
     </w:p>
     <w:p>
@@ -3724,7 +3732,7 @@
         <w:rPr>
           <w:b w:val="0"/>
         </w:rPr>
-        <w:t>Payments you already sent to a state are not stored here. Partial refund tax is not guessed. Refunds made directly in Stripe, disputes, missing tax records, or missing delivery states may need review. A later full refund can change the report for the earlier order period because the report uses the order’s current known status.</w:t>
+        <w:t>Keep your state payment records beside this report. If it shows $50 for Texas and you already paid Texas $20, it still shows $50. The shop doesn’t record those payments; you need your own records to work out what remains.</w:t>
       </w:r>
     </w:p>
     <w:p>
@@ -3732,7 +3740,7 @@
         <w:rPr>
           <w:b w:val="0"/>
         </w:rPr>
-        <w:t>For example, if net recorded Texas tax is $50 and you already paid the state $20, this dashboard does not automatically turn its $50 into a $30 balance. Reconcile payments, refunds, and the state’s filing rules in your records. Today’s nexus selections do not erase historical state rows.</w:t>
+        <w:t>Check partial refunds separately; their tax amount is not known here. Review refunds made directly in Stripe, disputed payments, and missing-information warnings too. A later full refund can change an earlier order’s report. An empty report or $0 recorded tax doesn’t by itself mean you owe nothing.</w:t>
       </w:r>
     </w:p>
     <w:p>
@@ -3756,7 +3764,7 @@
         <w:rPr>
           <w:b w:val="0"/>
         </w:rPr>
-        <w:t>2. Compare the orders with Stripe and your refund records. Keep any sales made outside this platform with your business records too.</w:t>
+        <w:t>2. Compare the orders with Stripe and your refund records. Include any art you sold outside the website in your business records too.</w:t>
       </w:r>
     </w:p>
     <w:p>
@@ -3772,7 +3780,7 @@
         <w:rPr>
           <w:b w:val="0"/>
         </w:rPr>
-        <w:t>4. Before offering new sizes, check their files, actual measurements, prices, and availability. Recheck prices when costs or tax mode change. Saved product options remain available until you change their status or another selling requirement changes.</w:t>
+        <w:t>4. Before offering new sizes, check their files, actual measurements, prices, and availability. Take another look at prices when costs or your tax choice change. Your saved sizes stay with the product; you only need to edit them when something changes.</w:t>
       </w:r>
     </w:p>
     <w:p>
@@ -3803,7 +3811,7 @@
         <w:rPr>
           <w:b w:val="0"/>
         </w:rPr>
-        <w:t>Tax sources checked September 14 2026. Follow the current state instructions for your business, especially for exemptions, local sourcing, or unusual sales.</w:t>
+        <w:t>Here are the Texas and Stripe instructions. Check the current state rules before filing, especially for refunds or tax-free sales.</w:t>
       </w:r>
     </w:p>
     <w:p>

</xml_diff>

<commit_message>
Pair markup and gross margin across pricing controls and guides
</commit_message>
<xml_diff>
--- a/deliverables/Margaret ArtByMe Product Pricing and Sales Tax Guide.docx
+++ b/deliverables/Margaret ArtByMe Product Pricing and Sales Tax Guide.docx
@@ -114,13 +114,9 @@
       </w:hyperlink>
     </w:p>
     <w:p>
-      <w:r>
-        <w:br w:type="page"/>
-      </w:r>
-    </w:p>
-    <w:p>
       <w:pPr>
         <w:pStyle w:val="Heading1"/>
+        <w:pageBreakBefore/>
       </w:pPr>
       <w:r>
         <w:t>Create a product and keep its options</w:t>
@@ -246,13 +242,9 @@
       </w:hyperlink>
     </w:p>
     <w:p>
-      <w:r>
-        <w:br w:type="page"/>
-      </w:r>
-    </w:p>
-    <w:p>
       <w:pPr>
         <w:pStyle w:val="Heading1"/>
+        <w:pageBreakBefore/>
       </w:pPr>
       <w:r>
         <w:t>Understand Small Medium and Large</w:t>
@@ -876,13 +868,9 @@
       </w:r>
     </w:p>
     <w:p>
-      <w:r>
-        <w:br w:type="page"/>
-      </w:r>
-    </w:p>
-    <w:p>
       <w:pPr>
         <w:pStyle w:val="Heading1"/>
+        <w:pageBreakBefore/>
       </w:pPr>
       <w:r>
         <w:t>Add more sizes or make an exact common size</w:t>
@@ -1000,13 +988,9 @@
       </w:hyperlink>
     </w:p>
     <w:p>
-      <w:r>
-        <w:br w:type="page"/>
-      </w:r>
-    </w:p>
-    <w:p>
       <w:pPr>
         <w:pStyle w:val="Heading1"/>
+        <w:pageBreakBefore/>
       </w:pPr>
       <w:r>
         <w:t>Understand markup profit and gross margin</w:t>
@@ -1017,7 +1001,7 @@
         <w:rPr>
           <w:b w:val="0"/>
         </w:rPr>
-        <w:t>Here is how I’d think about pricing. Start with what the print costs you, then add the money you want to earn. In the Lumaprints editor, Margin % is the extra percentage added to your cost. That is called markup. The Gross number answers a different question: how much of the selling price is left after the print and shipping costs?</w:t>
+        <w:t>I changed the field called Margin to Markup because that is what it was calculating: the extra percentage you add to your cost. Beside it, Gross margin shows the share of your selling price left after print and shipping costs. You can edit either percentage and the other updates. They describe the same price in two different ways.</w:t>
       </w:r>
     </w:p>
     <w:p>
@@ -1041,7 +1025,7 @@
         <w:rPr>
           <w:b w:val="0"/>
         </w:rPr>
-        <w:t>2. Enter 100 in Margin %. A percentage means “out of 100.” A 100% markup adds the whole cost one more time. One whole $20 cost means $20 extra.</w:t>
+        <w:t>2. Enter 100 in Markup (%), or enter 50 in Gross margin (%). Both give the same price. A 100% markup adds the whole $20 cost one more time: $20 extra.</w:t>
       </w:r>
     </w:p>
     <w:p>
@@ -2041,7 +2025,7 @@
               <w:rPr>
                 <w:sz w:val="20"/>
               </w:rPr>
-              <w:t>66.7%</w:t>
+              <w:t>66.67%</w:t>
             </w:r>
           </w:p>
         </w:tc>
@@ -2067,7 +2051,7 @@
         <w:rPr>
           <w:b w:val="0"/>
         </w:rPr>
-        <w:t>If you see 200 in a size’s Margin % field, it adds twice the total cost. With a $20 cost, that adds $40: $20 + $40 = a $60 price. The $40 gross profit is about two thirds of $60, so Gross is about 67%.</w:t>
+        <w:t>At 200% markup, $20 × 200 ÷ 100 = $40 extra. Add the cost: $20 + $40 = a $60 price. Gross margin is $40 ÷ $60 × 100 ≈ 66.67%. Remember: cost × markup ÷ 100 finds the extra dollars, not the selling price.</w:t>
       </w:r>
     </w:p>
     <w:p>
@@ -2075,7 +2059,15 @@
         <w:rPr>
           <w:b w:val="0"/>
         </w:rPr>
-        <w:t>I’d use Gross to help choose a price, then leave room for your other expenses. Card fees, advertising, your time, refunds, and any sales tax included in the price still have to come out. The shipping cost saved with the size helps with this estimate; the actual postage can vary from order to order.</w:t>
+        <w:t>Gross margin helps you choose a price, but card fees, your time, advertising, refunds, and included sales tax still have to come out. Shipping is a saved estimate; actual postage can vary.</w:t>
+      </w:r>
+    </w:p>
+    <w:p>
+      <w:r>
+        <w:rPr>
+          <w:b w:val="0"/>
+        </w:rPr>
+        <w:t>A 100% gross margin would leave the whole price as profit and nothing to pay for the print. That cannot work when the print costs money. A 100% markup is fine: it doubles cost and gives a 50% gross margin.</w:t>
       </w:r>
     </w:p>
     <w:p>
@@ -2094,13 +2086,9 @@
       </w:hyperlink>
     </w:p>
     <w:p>
-      <w:r>
-        <w:br w:type="page"/>
-      </w:r>
-    </w:p>
-    <w:p>
       <w:pPr>
         <w:pStyle w:val="Heading1"/>
+        <w:pageBreakBefore/>
       </w:pPr>
       <w:r>
         <w:t>Set the price rules you want to use</w:t>
@@ -2135,7 +2123,7 @@
         <w:rPr>
           <w:b w:val="0"/>
         </w:rPr>
-        <w:t>Leave a custom markup blank to use the broader setting. Enter 0 to add nothing to the cost. A manual price stays fixed when supplier costs change, so check it after refreshing costs.</w:t>
+        <w:t>Leave the percentage fields blank to use the broader setting. Enter 0 to add nothing to cost. A manual price stays fixed; its percentage fields show that price’s result and cannot be edited. Unknown costs mean the profit estimate is not available.</w:t>
       </w:r>
     </w:p>
     <w:tbl>
@@ -2278,7 +2266,7 @@
               <w:rPr>
                 <w:sz w:val="20"/>
               </w:rPr>
-              <w:t>Settings → Pricing → Default Margin (%) → Save Pricing Settings</w:t>
+              <w:t>Settings → Pricing → Markup (%) or Gross margin (%) → Save Pricing Settings</w:t>
             </w:r>
           </w:p>
         </w:tc>
@@ -2343,7 +2331,7 @@
               <w:rPr>
                 <w:sz w:val="20"/>
               </w:rPr>
-              <w:t>Products → Manage Categories → Default margin %. Click outside the field to save.</w:t>
+              <w:t>Products → Manage Categories → edit either percentage. Click outside the fields to save.</w:t>
             </w:r>
           </w:p>
         </w:tc>
@@ -2408,7 +2396,7 @@
               <w:rPr>
                 <w:sz w:val="20"/>
               </w:rPr>
-              <w:t>Product editor → Default margin (%) → Save margin + refresh prices</w:t>
+              <w:t>Product editor → Default print pricing → edit either percentage → Save markup + refresh prices</w:t>
             </w:r>
           </w:p>
         </w:tc>
@@ -2473,7 +2461,7 @@
               <w:rPr>
                 <w:sz w:val="20"/>
               </w:rPr>
-              <w:t>Edit its Margin % row. Wait for the automatic save, watch for an error, then reload to check.</w:t>
+              <w:t>Edit either percentage. Wait for the automatic save, then reload to check.</w:t>
             </w:r>
           </w:p>
         </w:tc>
@@ -2538,7 +2526,7 @@
               <w:rPr>
                 <w:sz w:val="20"/>
               </w:rPr>
-              <w:t>Use the price pencil. A star marks an override. Clear the manual amount to return to automatic pricing.</w:t>
+              <w:t>Use the price pencil. A star marks a manual price. Clear it to edit the percentage pair again.</w:t>
             </w:r>
           </w:p>
         </w:tc>
@@ -2623,13 +2611,9 @@
       </w:hyperlink>
     </w:p>
     <w:p>
-      <w:r>
-        <w:br w:type="page"/>
-      </w:r>
-    </w:p>
-    <w:p>
       <w:pPr>
         <w:pStyle w:val="Heading1"/>
+        <w:pageBreakBefore/>
       </w:pPr>
       <w:r>
         <w:t>Understand sales tax and nexus</w:t>
@@ -3022,13 +3006,9 @@
       </w:hyperlink>
     </w:p>
     <w:p>
-      <w:r>
-        <w:br w:type="page"/>
-      </w:r>
-    </w:p>
-    <w:p>
       <w:pPr>
         <w:pStyle w:val="Heading1"/>
+        <w:pageBreakBefore/>
       </w:pPr>
       <w:r>
         <w:t>See how included and separate tax affect money</w:t>
@@ -3537,13 +3517,9 @@
       </w:r>
     </w:p>
     <w:p>
-      <w:r>
-        <w:br w:type="page"/>
-      </w:r>
-    </w:p>
-    <w:p>
       <w:pPr>
         <w:pStyle w:val="Heading1"/>
+        <w:pageBreakBefore/>
       </w:pPr>
       <w:r>
         <w:t>Set up Texas collection step by step</w:t>
@@ -3683,13 +3659,9 @@
       </w:hyperlink>
     </w:p>
     <w:p>
-      <w:r>
-        <w:br w:type="page"/>
-      </w:r>
-    </w:p>
-    <w:p>
       <w:pPr>
         <w:pStyle w:val="Heading1"/>
+        <w:pageBreakBefore/>
       </w:pPr>
       <w:r>
         <w:t>Read the tax tracker and keep useful records</w:t>

</xml_diff>

<commit_message>
Support original and prints together and remove archived products from default list
</commit_message>
<xml_diff>
--- a/deliverables/Margaret ArtByMe Product Pricing and Sales Tax Guide.docx
+++ b/deliverables/Margaret ArtByMe Product Pricing and Sales Tax Guide.docx
@@ -159,7 +159,7 @@
         <w:rPr>
           <w:b w:val="0"/>
         </w:rPr>
-        <w:t>4. Add product images and select the primary picture. For Lumaprints, choose the correct master artwork. Press Save Changes to attach it before making print sizes.</w:t>
+        <w:t>4. To offer the original too, check Sell original artwork, enter a Base price above $0, and press Save Changes. This adds one original option to the same listing. Its price is separate from print markup.</w:t>
       </w:r>
     </w:p>
     <w:p>
@@ -167,7 +167,7 @@
         <w:rPr>
           <w:b w:val="0"/>
         </w:rPr>
-        <w:t>5. If needed, review the print crop, choose Save crop, and wait until the print master is ready. The picture used for the crop preview must match the same uncropped artwork as the master.</w:t>
+        <w:t>5. Add product images and select the primary picture. For Lumaprints, choose the correct master artwork. Press Save Changes to attach it before making print sizes.</w:t>
       </w:r>
     </w:p>
     <w:p>
@@ -175,7 +175,7 @@
         <w:rPr>
           <w:b w:val="0"/>
         </w:rPr>
-        <w:t>6. Under Editing prices for, choose Lumaprints or My studio. You can keep prices ready for both. Store currently uses tells you which set your customers will see. To change who handles new orders, use the shop’s fulfillment setting.</w:t>
+        <w:t>6. If needed, review the print crop, choose Save crop, and wait until the print master is ready. The picture used for the crop preview must match the same uncropped artwork as the master.</w:t>
       </w:r>
     </w:p>
     <w:p>
@@ -183,7 +183,7 @@
         <w:rPr>
           <w:b w:val="0"/>
         </w:rPr>
-        <w:t>7. Create the materials and sizes you want to offer, then check each selling price. For Lumaprints, use Generate S/M/L or Add print size. Page 4 explains the difference.</w:t>
+        <w:t>7. Under Editing prices for, choose Lumaprints or My studio. You can keep prices ready for both. Store currently uses tells you which set your customers will see. To change who handles new orders, use the shop’s fulfillment setting.</w:t>
       </w:r>
     </w:p>
     <w:p>
@@ -191,7 +191,7 @@
         <w:rPr>
           <w:b w:val="0"/>
         </w:rPr>
-        <w:t>8. Save each section with its own control. Save Changes saves main product details. The print-size dialog and studio-price area have their own save buttons.</w:t>
+        <w:t>8. Create the materials and sizes you want to offer, then check each selling price. For Lumaprints, use Generate S/M/L or Add print size. Page 4 explains the difference.</w:t>
       </w:r>
     </w:p>
     <w:p>
@@ -199,7 +199,23 @@
         <w:rPr>
           <w:b w:val="0"/>
         </w:rPr>
-        <w:t>9. When the product and its options are ready, set Status to Active and choose Save Changes. Open the public product and check each offered material, size, price, and shipping promise.</w:t>
+        <w:t>9. Save each section with its own control. Save Changes saves main product details. The print-size dialog and studio-price area have their own save buttons.</w:t>
+      </w:r>
+    </w:p>
+    <w:p>
+      <w:r>
+        <w:rPr>
+          <w:b w:val="0"/>
+        </w:rPr>
+        <w:t>10. When the product and its options are ready, set Status to Active and choose Save Changes. Open the public product and check each offered material, size, price, and shipping promise.</w:t>
+      </w:r>
+    </w:p>
+    <w:p>
+      <w:r>
+        <w:rPr>
+          <w:b w:val="0"/>
+        </w:rPr>
+        <w:t>You ship the original. When Lumaprints fulfillment is enabled, Lumaprints makes and ships the live prints. Uncheck Sell original artwork and save to remove only the original from sale. Prints stay available after the original sells. Checking the box again does not restock a sold original.</w:t>
       </w:r>
     </w:p>
     <w:p>

</xml_diff>